<commit_message>
Update scripts for caged_rais dataframes and document it in BASE DE DADOS EXISTENTE.docx
</commit_message>
<xml_diff>
--- a/BASE DE DADOS EXISTENTE.docx
+++ b/BASE DE DADOS EXISTENTE.docx
@@ -234,6 +234,13 @@
             <w:tcW w:w="2790" w:type="dxa"/>
           </w:tcPr>
           <w:p>
+            <w:pPr>
+              <w:rPr>
+                <w:sz w:val="20"/>
+                <w:szCs w:val="20"/>
+                <w:lang w:val="pt-BR"/>
+              </w:rPr>
+            </w:pPr>
             <w:hyperlink r:id="rId7" w:history="1">
               <w:r>
                 <w:rPr>
@@ -245,19 +252,6 @@
                 <w:t>https://github.com/Zagamog/TechBrasil/blob/main/prelims/popula%C3%A7%C3%A3o/br_pop1a.R</w:t>
               </w:r>
             </w:hyperlink>
-          </w:p>
-          <w:p/>
-          <w:p>
-            <w:pPr>
-              <w:rPr>
-                <w:sz w:val="20"/>
-                <w:szCs w:val="20"/>
-                <w:lang w:val="pt-BR"/>
-              </w:rPr>
-            </w:pPr>
-            <w:r>
-              <w:t>extracy_transition_points.R</w:t>
-            </w:r>
           </w:p>
         </w:tc>
         <w:tc>
@@ -349,7 +343,7 @@
                   <w:sz w:val="20"/>
                   <w:szCs w:val="20"/>
                 </w:rPr>
-                <w:t>https://github.com/Zagamog/TechBrasil/blob/main/RShiny/AmazEduPopu1/AmazEduPopu1_ShinyPT.R</w:t>
+                <w:t>https://github.com/Zagamog/TechBrasil/blob/main/prelims/popula%C3%A7%C3%A3o/AmazEduPopu1_ShinyEN.R</w:t>
               </w:r>
             </w:hyperlink>
             <w:r>
@@ -359,6 +353,14 @@
               </w:rPr>
               <w:t xml:space="preserve"> </w:t>
             </w:r>
+          </w:p>
+          <w:p>
+            <w:pPr>
+              <w:rPr>
+                <w:sz w:val="20"/>
+                <w:szCs w:val="20"/>
+              </w:rPr>
+            </w:pPr>
             <w:r>
               <w:rPr>
                 <w:noProof/>
@@ -941,7 +943,7 @@
                 <w:szCs w:val="20"/>
               </w:rPr>
               <w:drawing>
-                <wp:anchor distT="0" distB="0" distL="114300" distR="114300" simplePos="0" relativeHeight="251660288" behindDoc="1" locked="0" layoutInCell="1" allowOverlap="1" wp14:anchorId="06B6BBF4" wp14:editId="1616D4E9">
+                <wp:anchor distT="0" distB="0" distL="114300" distR="114300" simplePos="0" relativeHeight="251660288" behindDoc="1" locked="0" layoutInCell="1" allowOverlap="1" wp14:anchorId="06B6BBF4" wp14:editId="70CB65EF">
                   <wp:simplePos x="0" y="0"/>
                   <wp:positionH relativeFrom="column">
                     <wp:posOffset>2418080</wp:posOffset>
@@ -1011,7 +1013,7 @@
                 <w:szCs w:val="20"/>
               </w:rPr>
               <w:drawing>
-                <wp:anchor distT="0" distB="0" distL="114300" distR="114300" simplePos="0" relativeHeight="251658240" behindDoc="1" locked="0" layoutInCell="1" allowOverlap="1" wp14:anchorId="0AC224F8" wp14:editId="42035D15">
+                <wp:anchor distT="0" distB="0" distL="114300" distR="114300" simplePos="0" relativeHeight="251658240" behindDoc="1" locked="0" layoutInCell="1" allowOverlap="1" wp14:anchorId="0AC224F8" wp14:editId="1763F56F">
                   <wp:simplePos x="0" y="0"/>
                   <wp:positionH relativeFrom="column">
                     <wp:posOffset>2418080</wp:posOffset>
@@ -1075,7 +1077,7 @@
                 <w:szCs w:val="20"/>
               </w:rPr>
               <w:drawing>
-                <wp:anchor distT="0" distB="0" distL="114300" distR="114300" simplePos="0" relativeHeight="251659264" behindDoc="1" locked="0" layoutInCell="1" allowOverlap="1" wp14:anchorId="38BEAC34" wp14:editId="52C3F10D">
+                <wp:anchor distT="0" distB="0" distL="114300" distR="114300" simplePos="0" relativeHeight="251659264" behindDoc="1" locked="0" layoutInCell="1" allowOverlap="1" wp14:anchorId="38BEAC34" wp14:editId="7BAF83E5">
                   <wp:simplePos x="0" y="0"/>
                   <wp:positionH relativeFrom="column">
                     <wp:posOffset>-65405</wp:posOffset>
@@ -2607,6 +2609,7 @@
               <w:rPr>
                 <w:sz w:val="20"/>
                 <w:szCs w:val="20"/>
+                <w:lang w:val="pt-BR"/>
               </w:rPr>
             </w:pPr>
           </w:p>
@@ -2620,6 +2623,7 @@
               <w:rPr>
                 <w:sz w:val="20"/>
                 <w:szCs w:val="20"/>
+                <w:lang w:val="pt-BR"/>
               </w:rPr>
             </w:pPr>
           </w:p>
@@ -3814,7 +3818,6 @@
               <w:rPr>
                 <w:sz w:val="20"/>
                 <w:szCs w:val="20"/>
-                <w:lang w:val="pt-BR"/>
               </w:rPr>
             </w:pPr>
             <w:hyperlink r:id="rId38" w:history="1">
@@ -3823,7 +3826,6 @@
                   <w:rStyle w:val="Hyperlink"/>
                   <w:sz w:val="20"/>
                   <w:szCs w:val="20"/>
-                  <w:lang w:val="pt-BR"/>
                 </w:rPr>
                 <w:t>https://github.com/Zagamog/TechBrasil/blob/main/prelims/mec/prepara_censo_escolar.R</w:t>
               </w:r>
@@ -3834,16 +3836,14 @@
               <w:rPr>
                 <w:sz w:val="20"/>
                 <w:szCs w:val="20"/>
-                <w:lang w:val="pt-BR"/>
-              </w:rPr>
-            </w:pPr>
-          </w:p>
-          <w:p>
-            <w:pPr>
-              <w:rPr>
-                <w:sz w:val="20"/>
-                <w:szCs w:val="20"/>
-                <w:lang w:val="pt-BR"/>
+              </w:rPr>
+            </w:pPr>
+          </w:p>
+          <w:p>
+            <w:pPr>
+              <w:rPr>
+                <w:sz w:val="20"/>
+                <w:szCs w:val="20"/>
               </w:rPr>
             </w:pPr>
           </w:p>
@@ -3858,12 +3858,14 @@
               <w:rPr>
                 <w:sz w:val="20"/>
                 <w:szCs w:val="20"/>
-              </w:rPr>
-            </w:pPr>
-            <w:r>
-              <w:rPr>
-                <w:sz w:val="20"/>
-                <w:szCs w:val="20"/>
+                <w:lang w:val="pt-BR"/>
+              </w:rPr>
+            </w:pPr>
+            <w:r>
+              <w:rPr>
+                <w:sz w:val="20"/>
+                <w:szCs w:val="20"/>
+                <w:lang w:val="pt-BR"/>
               </w:rPr>
               <w:t>&gt;&gt; prepara_censo_escolar.R; prepara_censo_escolar_tecnico.R</w:t>
             </w:r>
@@ -3873,12 +3875,14 @@
               <w:rPr>
                 <w:sz w:val="20"/>
                 <w:szCs w:val="20"/>
-              </w:rPr>
-            </w:pPr>
-            <w:r>
-              <w:rPr>
-                <w:sz w:val="20"/>
-                <w:szCs w:val="20"/>
+                <w:lang w:val="pt-BR"/>
+              </w:rPr>
+            </w:pPr>
+            <w:r>
+              <w:rPr>
+                <w:sz w:val="20"/>
+                <w:szCs w:val="20"/>
+                <w:lang w:val="pt-BR"/>
               </w:rPr>
               <w:t xml:space="preserve">&gt;&gt; </w:t>
             </w:r>
@@ -3886,6 +3890,7 @@
               <w:rPr>
                 <w:sz w:val="20"/>
                 <w:szCs w:val="20"/>
+                <w:lang w:val="pt-BR"/>
               </w:rPr>
               <w:t>m</w:t>
             </w:r>
@@ -3893,6 +3898,7 @@
               <w:rPr>
                 <w:sz w:val="20"/>
                 <w:szCs w:val="20"/>
+                <w:lang w:val="pt-BR"/>
               </w:rPr>
               <w:t>atriculas1UF</w:t>
             </w:r>
@@ -3900,6 +3906,7 @@
               <w:rPr>
                 <w:sz w:val="20"/>
                 <w:szCs w:val="20"/>
+                <w:lang w:val="pt-BR"/>
               </w:rPr>
               <w:t xml:space="preserve">.R; matriculas1RINT.R; matriculas1RINM.R </w:t>
             </w:r>
@@ -3909,12 +3916,14 @@
               <w:rPr>
                 <w:sz w:val="20"/>
                 <w:szCs w:val="20"/>
-              </w:rPr>
-            </w:pPr>
-            <w:r>
-              <w:rPr>
-                <w:sz w:val="20"/>
-                <w:szCs w:val="20"/>
+                <w:lang w:val="pt-BR"/>
+              </w:rPr>
+            </w:pPr>
+            <w:r>
+              <w:rPr>
+                <w:sz w:val="20"/>
+                <w:szCs w:val="20"/>
+                <w:lang w:val="pt-BR"/>
               </w:rPr>
               <w:t>&gt;&gt; matriculas1supl_tecUF.R; matriculas1supl_tecRINT.R; matriculas1supl_tec_RINM.R</w:t>
             </w:r>
@@ -3924,12 +3933,14 @@
               <w:rPr>
                 <w:sz w:val="20"/>
                 <w:szCs w:val="20"/>
-              </w:rPr>
-            </w:pPr>
-            <w:r>
-              <w:rPr>
-                <w:sz w:val="20"/>
-                <w:szCs w:val="20"/>
+                <w:lang w:val="pt-BR"/>
+              </w:rPr>
+            </w:pPr>
+            <w:r>
+              <w:rPr>
+                <w:sz w:val="20"/>
+                <w:szCs w:val="20"/>
+                <w:lang w:val="pt-BR"/>
               </w:rPr>
               <w:t>&gt;&gt; matriculas1supl_tecUF_CURSO.R; matriculas1supl_tecRINT_CURSO.R; matriculas1supl_tec_RIME.CURSO.R</w:t>
             </w:r>
@@ -3993,14 +4004,12 @@
               <w:rPr>
                 <w:sz w:val="20"/>
                 <w:szCs w:val="20"/>
-                <w:lang w:val="pt-BR"/>
-              </w:rPr>
-            </w:pPr>
-            <w:r>
-              <w:rPr>
-                <w:sz w:val="20"/>
-                <w:szCs w:val="20"/>
-                <w:lang w:val="pt-BR"/>
+              </w:rPr>
+            </w:pPr>
+            <w:r>
+              <w:rPr>
+                <w:sz w:val="20"/>
+                <w:szCs w:val="20"/>
               </w:rPr>
               <w:t xml:space="preserve">Bruto/Original:  </w:t>
             </w:r>
@@ -4010,7 +4019,6 @@
                   <w:rStyle w:val="Hyperlink"/>
                   <w:sz w:val="20"/>
                   <w:szCs w:val="20"/>
-                  <w:lang w:val="pt-BR"/>
                 </w:rPr>
                 <w:t>https://techbrazildata.s3.us-east-1.amazonaws.com/rawdata/mec_inep/microdados_ed_basica_2007.csv</w:t>
               </w:r>
@@ -4019,7 +4027,6 @@
               <w:rPr>
                 <w:sz w:val="20"/>
                 <w:szCs w:val="20"/>
-                <w:lang w:val="pt-BR"/>
               </w:rPr>
               <w:t xml:space="preserve"> to 2024 and also </w:t>
             </w:r>
@@ -4029,7 +4036,6 @@
                   <w:rStyle w:val="Hyperlink"/>
                   <w:sz w:val="20"/>
                   <w:szCs w:val="20"/>
-                  <w:lang w:val="pt-BR"/>
                 </w:rPr>
                 <w:t>https://techbrazildata.s3.us-east-1.amazonaws.com/rawdata/mec_inep/suplemento_cursos_tecnicos_2023.csv</w:t>
               </w:r>
@@ -4038,7 +4044,6 @@
               <w:rPr>
                 <w:sz w:val="20"/>
                 <w:szCs w:val="20"/>
-                <w:lang w:val="pt-BR"/>
               </w:rPr>
               <w:t xml:space="preserve"> and 2024 for suplemento tecnico</w:t>
             </w:r>
@@ -4126,14 +4131,12 @@
               <w:rPr>
                 <w:sz w:val="20"/>
                 <w:szCs w:val="20"/>
-                <w:lang w:val="pt-BR"/>
-              </w:rPr>
-            </w:pPr>
-            <w:r>
-              <w:rPr>
-                <w:sz w:val="20"/>
-                <w:szCs w:val="20"/>
-                <w:lang w:val="pt-BR"/>
+              </w:rPr>
+            </w:pPr>
+            <w:r>
+              <w:rPr>
+                <w:sz w:val="20"/>
+                <w:szCs w:val="20"/>
               </w:rPr>
               <w:t xml:space="preserve">&gt;&gt; technical courses for 2023 and 2024 only df_mat_uf; df_mat_eixo; df_mat_area; df_mat_curso </w:t>
             </w:r>
@@ -4143,14 +4146,12 @@
               <w:rPr>
                 <w:sz w:val="20"/>
                 <w:szCs w:val="20"/>
-                <w:lang w:val="pt-BR"/>
-              </w:rPr>
-            </w:pPr>
-            <w:r>
-              <w:rPr>
-                <w:sz w:val="20"/>
-                <w:szCs w:val="20"/>
-                <w:lang w:val="pt-BR"/>
+              </w:rPr>
+            </w:pPr>
+            <w:r>
+              <w:rPr>
+                <w:sz w:val="20"/>
+                <w:szCs w:val="20"/>
               </w:rPr>
               <w:t xml:space="preserve">&gt;&gt; Garabed data for technical courses before 2023 (UF level only) Tecnico_Forma_Curso_Garabed1a.rda ; </w:t>
             </w:r>
@@ -4289,6 +4290,7 @@
                 <w:color w:val="00B050"/>
                 <w:sz w:val="20"/>
                 <w:szCs w:val="20"/>
+                <w:lang w:val="pt-BR"/>
               </w:rPr>
             </w:pPr>
             <w:r>
@@ -4298,19 +4300,22 @@
                 <w:color w:val="00B050"/>
                 <w:sz w:val="20"/>
                 <w:szCs w:val="20"/>
-              </w:rPr>
-              <w:t>prepara_censo_escolar.R; prepara_censo_escolar_tec</w:t>
-            </w:r>
-            <w:r>
+                <w:lang w:val="pt-BR"/>
+              </w:rPr>
+              <w:t>prepara_censo_escolar.R; prepara_censo_escolar_tecnico.R</w:t>
+            </w:r>
+          </w:p>
+          <w:p>
+            <w:pPr>
               <w:rPr>
                 <w:b/>
                 <w:bCs/>
                 <w:color w:val="00B050"/>
                 <w:sz w:val="20"/>
                 <w:szCs w:val="20"/>
-              </w:rPr>
-              <w:t>n</w:t>
-            </w:r>
+                <w:lang w:val="pt-BR"/>
+              </w:rPr>
+            </w:pPr>
             <w:r>
               <w:rPr>
                 <w:b/>
@@ -4318,8 +4323,9 @@
                 <w:color w:val="00B050"/>
                 <w:sz w:val="20"/>
                 <w:szCs w:val="20"/>
-              </w:rPr>
-              <w:t>ico.R</w:t>
+                <w:lang w:val="pt-BR"/>
+              </w:rPr>
+              <w:t>matriculas1UF.R; matriculas1RINT.R; matriculas1RINM.R;</w:t>
             </w:r>
           </w:p>
           <w:p>
@@ -4330,6 +4336,7 @@
                 <w:color w:val="00B050"/>
                 <w:sz w:val="20"/>
                 <w:szCs w:val="20"/>
+                <w:lang w:val="pt-BR"/>
               </w:rPr>
             </w:pPr>
             <w:r>
@@ -4339,8 +4346,9 @@
                 <w:color w:val="00B050"/>
                 <w:sz w:val="20"/>
                 <w:szCs w:val="20"/>
-              </w:rPr>
-              <w:t>matriculas1UF.R; matriculas1RINT.R; matriculas1RINM.R;</w:t>
+                <w:lang w:val="pt-BR"/>
+              </w:rPr>
+              <w:t>matriculas1supl_tecUF.R; matriculas1supl_tecRINT.R; matriculas1supl_tec_RINM.R</w:t>
             </w:r>
           </w:p>
           <w:p>
@@ -4351,6 +4359,7 @@
                 <w:color w:val="00B050"/>
                 <w:sz w:val="20"/>
                 <w:szCs w:val="20"/>
+                <w:lang w:val="pt-BR"/>
               </w:rPr>
             </w:pPr>
             <w:r>
@@ -4360,8 +4369,9 @@
                 <w:color w:val="00B050"/>
                 <w:sz w:val="20"/>
                 <w:szCs w:val="20"/>
-              </w:rPr>
-              <w:t>matriculas1supl_tecUF.R; matriculas1supl_tecRINT.R; matriculas1supl_tec_RINM.R</w:t>
+                <w:lang w:val="pt-BR"/>
+              </w:rPr>
+              <w:t>matriculas1supl_tecUF_CURSO.R; matriculas1supl_tecRINT_CURSO.R; matriculas1supl_tec_RIME.CURSO.R</w:t>
             </w:r>
           </w:p>
           <w:p>
@@ -4372,6 +4382,7 @@
                 <w:color w:val="00B050"/>
                 <w:sz w:val="20"/>
                 <w:szCs w:val="20"/>
+                <w:lang w:val="pt-BR"/>
               </w:rPr>
             </w:pPr>
             <w:r>
@@ -4381,28 +4392,7 @@
                 <w:color w:val="00B050"/>
                 <w:sz w:val="20"/>
                 <w:szCs w:val="20"/>
-              </w:rPr>
-              <w:t>matriculas1supl_tecUF_CURSO.R; matriculas1supl_tecRINT_CURSO.R; matriculas1supl_tec_RIME.CURSO.R</w:t>
-            </w:r>
-          </w:p>
-          <w:p>
-            <w:pPr>
-              <w:rPr>
-                <w:b/>
-                <w:bCs/>
-                <w:color w:val="00B050"/>
-                <w:sz w:val="20"/>
-                <w:szCs w:val="20"/>
-                <w:lang w:val="pt-BR"/>
-              </w:rPr>
-            </w:pPr>
-            <w:r>
-              <w:rPr>
-                <w:b/>
-                <w:bCs/>
-                <w:color w:val="00B050"/>
-                <w:sz w:val="20"/>
-                <w:szCs w:val="20"/>
+                <w:lang w:val="pt-BR"/>
               </w:rPr>
               <w:t>Censo_UF_garabed1a.R; Censo_UF_garabed1a.R</w:t>
             </w:r>
@@ -4879,14 +4869,12 @@
               <w:rPr>
                 <w:sz w:val="20"/>
                 <w:szCs w:val="20"/>
-                <w:lang w:val="pt-BR"/>
-              </w:rPr>
-            </w:pPr>
-            <w:r>
-              <w:rPr>
-                <w:sz w:val="20"/>
-                <w:szCs w:val="20"/>
-                <w:lang w:val="pt-BR"/>
+              </w:rPr>
+            </w:pPr>
+            <w:r>
+              <w:rPr>
+                <w:sz w:val="20"/>
+                <w:szCs w:val="20"/>
               </w:rPr>
               <w:t xml:space="preserve">Procesado: </w:t>
             </w:r>
@@ -4896,7 +4884,6 @@
                   <w:rStyle w:val="Hyperlink"/>
                   <w:sz w:val="20"/>
                   <w:szCs w:val="20"/>
-                  <w:lang w:val="pt-BR"/>
                 </w:rPr>
                 <w:t>https://us-east-1.console.aws.amazon.com/s3/object/techbrazildata?region=us-east-1&amp;bucketType=general&amp;prefix=working/mec_outros/df_cnct2025a.csv</w:t>
               </w:r>
@@ -4905,7 +4892,6 @@
               <w:rPr>
                 <w:sz w:val="20"/>
                 <w:szCs w:val="20"/>
-                <w:lang w:val="pt-BR"/>
               </w:rPr>
               <w:t xml:space="preserve"> </w:t>
             </w:r>
@@ -4913,7 +4899,6 @@
               <w:rPr>
                 <w:sz w:val="20"/>
                 <w:szCs w:val="20"/>
-                <w:lang w:val="pt-BR"/>
               </w:rPr>
               <w:t>; also .pkl and .rds</w:t>
             </w:r>
@@ -5798,14 +5783,12 @@
               <w:rPr>
                 <w:sz w:val="20"/>
                 <w:szCs w:val="20"/>
-                <w:lang w:val="pt-BR"/>
-              </w:rPr>
-            </w:pPr>
-            <w:r>
-              <w:rPr>
-                <w:sz w:val="20"/>
-                <w:szCs w:val="20"/>
-                <w:lang w:val="pt-BR"/>
+              </w:rPr>
+            </w:pPr>
+            <w:r>
+              <w:rPr>
+                <w:sz w:val="20"/>
+                <w:szCs w:val="20"/>
               </w:rPr>
               <w:t xml:space="preserve">Procesado: </w:t>
             </w:r>
@@ -5815,7 +5798,6 @@
                   <w:rStyle w:val="Hyperlink"/>
                   <w:sz w:val="20"/>
                   <w:szCs w:val="20"/>
-                  <w:lang w:val="pt-BR"/>
                 </w:rPr>
                 <w:t>https://techbrazildata.s3.us-east-1.amazonaws.com/working/qbq/qbq_ocup.rda</w:t>
               </w:r>
@@ -5824,7 +5806,6 @@
               <w:rPr>
                 <w:sz w:val="20"/>
                 <w:szCs w:val="20"/>
-                <w:lang w:val="pt-BR"/>
               </w:rPr>
               <w:t xml:space="preserve"> </w:t>
             </w:r>
@@ -5832,7 +5813,6 @@
               <w:rPr>
                 <w:sz w:val="20"/>
                 <w:szCs w:val="20"/>
-                <w:lang w:val="pt-BR"/>
               </w:rPr>
               <w:t>;</w:t>
             </w:r>
@@ -5840,7 +5820,6 @@
               <w:rPr>
                 <w:sz w:val="20"/>
                 <w:szCs w:val="20"/>
-                <w:lang w:val="pt-BR"/>
               </w:rPr>
               <w:t xml:space="preserve"> df_mat_uf; df_mat_eixo and so on – enrollment by curso and aggregated</w:t>
             </w:r>
@@ -5848,7 +5827,6 @@
               <w:rPr>
                 <w:sz w:val="20"/>
                 <w:szCs w:val="20"/>
-                <w:lang w:val="pt-BR"/>
               </w:rPr>
               <w:t>;</w:t>
             </w:r>
@@ -5858,14 +5836,12 @@
               <w:rPr>
                 <w:sz w:val="20"/>
                 <w:szCs w:val="20"/>
-                <w:lang w:val="pt-BR"/>
-              </w:rPr>
-            </w:pPr>
-            <w:r>
-              <w:rPr>
-                <w:sz w:val="20"/>
-                <w:szCs w:val="20"/>
-                <w:lang w:val="pt-BR"/>
+              </w:rPr>
+            </w:pPr>
+            <w:r>
+              <w:rPr>
+                <w:sz w:val="20"/>
+                <w:szCs w:val="20"/>
               </w:rPr>
               <w:t xml:space="preserve">match of  COD and CBO in /working/qbq/cbo_cod_match.rda </w:t>
             </w:r>
@@ -5956,7 +5932,6 @@
                 <w:bCs/>
                 <w:sz w:val="20"/>
                 <w:szCs w:val="20"/>
-                <w:lang w:val="pt-BR"/>
               </w:rPr>
             </w:pPr>
             <w:r>
@@ -5966,7 +5941,6 @@
                 <w:color w:val="47D459" w:themeColor="accent3" w:themeTint="99"/>
                 <w:sz w:val="20"/>
                 <w:szCs w:val="20"/>
-                <w:lang w:val="pt-BR"/>
               </w:rPr>
               <w:t>qbq1a.R  to qbq4a.r; cod_cbo1.R to cod_cbo1f.R</w:t>
             </w:r>
@@ -7050,7 +7024,6 @@
                 <w:color w:val="0000FF"/>
                 <w:sz w:val="20"/>
                 <w:szCs w:val="20"/>
-                <w:lang w:val="pt-BR"/>
               </w:rPr>
             </w:pPr>
             <w:r>
@@ -7058,7 +7031,6 @@
                 <w:color w:val="0000FF"/>
                 <w:sz w:val="20"/>
                 <w:szCs w:val="20"/>
-                <w:lang w:val="pt-BR"/>
               </w:rPr>
               <w:t xml:space="preserve">RAIS – Employment Data for 2023 and 2024 </w:t>
             </w:r>
@@ -7073,7 +7045,6 @@
               <w:rPr>
                 <w:sz w:val="20"/>
                 <w:szCs w:val="20"/>
-                <w:lang w:val="pt-BR"/>
               </w:rPr>
             </w:pPr>
           </w:p>
@@ -7092,7 +7063,6 @@
               <w:rPr>
                 <w:sz w:val="20"/>
                 <w:szCs w:val="20"/>
-                <w:lang w:val="pt-BR"/>
               </w:rPr>
             </w:pPr>
           </w:p>
@@ -7342,14 +7312,12 @@
               <w:rPr>
                 <w:sz w:val="20"/>
                 <w:szCs w:val="20"/>
-                <w:lang w:val="pt-BR"/>
-              </w:rPr>
-            </w:pPr>
-            <w:r>
-              <w:rPr>
-                <w:sz w:val="20"/>
-                <w:szCs w:val="20"/>
-                <w:lang w:val="pt-BR"/>
+              </w:rPr>
+            </w:pPr>
+            <w:r>
+              <w:rPr>
+                <w:sz w:val="20"/>
+                <w:szCs w:val="20"/>
               </w:rPr>
               <w:t xml:space="preserve">Bruto/Original: </w:t>
             </w:r>
@@ -7359,7 +7327,6 @@
                   <w:rStyle w:val="Hyperlink"/>
                   <w:sz w:val="20"/>
                   <w:szCs w:val="20"/>
-                  <w:lang w:val="pt-BR"/>
                 </w:rPr>
                 <w:t>ftp://ftp.mtps.gov.br/pdet/microdados/RAIS/</w:t>
               </w:r>
@@ -7368,25 +7335,15 @@
               <w:rPr>
                 <w:sz w:val="20"/>
                 <w:szCs w:val="20"/>
-                <w:lang w:val="pt-BR"/>
-              </w:rPr>
-              <w:t xml:space="preserve"> in Windows explorer – by year and download to a local drive </w:t>
-            </w:r>
-            <w:r>
-              <w:rPr>
-                <w:sz w:val="20"/>
-                <w:szCs w:val="20"/>
-                <w:lang w:val="pt-BR"/>
-              </w:rPr>
-              <w:t>D:/Country/Brazil/TechBrazil/rawdata/rais/mintraemp_download</w:t>
-            </w:r>
-          </w:p>
-          <w:p>
-            <w:pPr>
-              <w:rPr>
-                <w:sz w:val="20"/>
-                <w:szCs w:val="20"/>
-                <w:lang w:val="pt-BR"/>
+              </w:rPr>
+              <w:t xml:space="preserve"> in Windows explorer – by year and download to a local drive D:/Country/Brazil/TechBrazil/rawdata/rais/mintraemp_download</w:t>
+            </w:r>
+          </w:p>
+          <w:p>
+            <w:pPr>
+              <w:rPr>
+                <w:sz w:val="20"/>
+                <w:szCs w:val="20"/>
               </w:rPr>
             </w:pPr>
           </w:p>
@@ -7981,12 +7938,14 @@
             <w:pPr>
               <w:rPr>
                 <w:noProof/>
-              </w:rPr>
-            </w:pPr>
-            <w:r>
-              <w:rPr>
-                <w:sz w:val="20"/>
-                <w:szCs w:val="20"/>
+                <w:lang w:val="pt-BR"/>
+              </w:rPr>
+            </w:pPr>
+            <w:r>
+              <w:rPr>
+                <w:sz w:val="20"/>
+                <w:szCs w:val="20"/>
+                <w:lang w:val="pt-BR"/>
               </w:rPr>
               <w:t xml:space="preserve">Bruto/Original: </w:t>
             </w:r>
@@ -7995,6 +7954,7 @@
                 <w:noProof/>
                 <w:sz w:val="20"/>
                 <w:szCs w:val="20"/>
+                <w:lang w:val="pt-BR"/>
               </w:rPr>
               <w:t xml:space="preserve"> </w:t>
             </w:r>
@@ -8003,6 +7963,7 @@
                 <w:noProof/>
                 <w:sz w:val="20"/>
                 <w:szCs w:val="20"/>
+                <w:lang w:val="pt-BR"/>
               </w:rPr>
               <w:t xml:space="preserve"> mec_inep: </w:t>
             </w:r>
@@ -8013,6 +7974,7 @@
                   <w:noProof/>
                   <w:sz w:val="20"/>
                   <w:szCs w:val="20"/>
+                  <w:lang w:val="pt-BR"/>
                 </w:rPr>
                 <w:t>https://us-east-1.console.aws.amazon.com/s3/buckets/techbrazildata?region=us-east-1&amp;bucketType=general&amp;prefix=rawdata/mec_inep/&amp;showversions=false</w:t>
               </w:r>
@@ -8022,6 +7984,7 @@
                 <w:noProof/>
                 <w:sz w:val="20"/>
                 <w:szCs w:val="20"/>
+                <w:lang w:val="pt-BR"/>
               </w:rPr>
               <w:t xml:space="preserve"> </w:t>
             </w:r>
@@ -8031,12 +7994,14 @@
               <w:rPr>
                 <w:sz w:val="20"/>
                 <w:szCs w:val="20"/>
-              </w:rPr>
-            </w:pPr>
-            <w:r>
-              <w:rPr>
-                <w:sz w:val="20"/>
-                <w:szCs w:val="20"/>
+                <w:lang w:val="pt-BR"/>
+              </w:rPr>
+            </w:pPr>
+            <w:r>
+              <w:rPr>
+                <w:sz w:val="20"/>
+                <w:szCs w:val="20"/>
+                <w:lang w:val="pt-BR"/>
               </w:rPr>
               <w:t xml:space="preserve">:/fundeb: </w:t>
             </w:r>
@@ -8046,6 +8011,7 @@
                   <w:rStyle w:val="Hyperlink"/>
                   <w:sz w:val="20"/>
                   <w:szCs w:val="20"/>
+                  <w:lang w:val="pt-BR"/>
                 </w:rPr>
                 <w:t>https://us-east-1.console.aws.amazon.com/s3/buckets/techbrazildata?region=us-east-1&amp;bucketType=general&amp;prefix=rawdata/fundeb/&amp;showversions=false</w:t>
               </w:r>
@@ -8054,6 +8020,7 @@
               <w:rPr>
                 <w:sz w:val="20"/>
                 <w:szCs w:val="20"/>
+                <w:lang w:val="pt-BR"/>
               </w:rPr>
               <w:t xml:space="preserve"> </w:t>
             </w:r>
@@ -8354,19 +8321,25 @@
               <w:rPr>
                 <w:lang w:val="pt-BR"/>
               </w:rPr>
-              <w:t xml:space="preserve"> ocupaçoes CBO 3 (profissões técnicas)</w:t>
-            </w:r>
-            <w:r>
-              <w:rPr>
-                <w:lang w:val="pt-BR"/>
-              </w:rPr>
-              <w:t xml:space="preserve"> (</w:t>
-            </w:r>
-            <w:r>
-              <w:rPr>
-                <w:lang w:val="pt-BR"/>
-              </w:rPr>
-              <w:t>Diferença salarial entre admitidos e demitidos e taxa de rotatividade por CBO 2 dígitos e região intermediária</w:t>
+              <w:t xml:space="preserve"> </w:t>
+            </w:r>
+            <w:r>
+              <w:rPr>
+                <w:lang w:val="pt-BR"/>
+              </w:rPr>
+              <w:t xml:space="preserve">nível CBO6-Município-ano </w:t>
+            </w:r>
+            <w:r>
+              <w:rPr>
+                <w:lang w:val="pt-BR"/>
+              </w:rPr>
+              <w:t>(</w:t>
+            </w:r>
+            <w:r>
+              <w:rPr>
+                <w:lang w:val="pt-BR"/>
+              </w:rPr>
+              <w:t>Diferença salarial entre admitidos e demitidos e taxa de rotatividade</w:t>
             </w:r>
             <w:r>
               <w:rPr>
@@ -8409,35 +8382,7 @@
                   <w:rStyle w:val="Hyperlink"/>
                   <w:lang w:val="pt-BR"/>
                 </w:rPr>
-                <w:t>https://github.com/Zagamog/TechBrasil/blob/main/prelims</w:t>
-              </w:r>
-              <w:r>
-                <w:rPr>
-                  <w:rStyle w:val="Hyperlink"/>
-                  <w:lang w:val="pt-BR"/>
-                </w:rPr>
-                <w:t>/caged</w:t>
-              </w:r>
-              <w:r>
-                <w:rPr>
-                  <w:rStyle w:val="Hyperlink"/>
-                  <w:lang w:val="pt-BR"/>
-                </w:rPr>
-                <w:t>/</w:t>
-              </w:r>
-              <w:r>
-                <w:rPr>
-                  <w:rStyle w:val="Hyperlink"/>
-                  <w:lang w:val="pt-BR"/>
-                </w:rPr>
-                <w:t>caged_rais_demanda.</w:t>
-              </w:r>
-              <w:r>
-                <w:rPr>
-                  <w:rStyle w:val="Hyperlink"/>
-                  <w:lang w:val="pt-BR"/>
-                </w:rPr>
-                <w:t>R</w:t>
+                <w:t>https://github.com/Zagamog/TechBrasil/blob/main/prelims/caged/caged_rais_demanda.R</w:t>
               </w:r>
             </w:hyperlink>
             <w:r>
@@ -8482,10 +8427,10 @@
                 <w:noProof/>
               </w:rPr>
               <w:drawing>
-                <wp:inline distT="0" distB="0" distL="0" distR="0" wp14:anchorId="6D8705EE" wp14:editId="0B7093C4">
-                  <wp:extent cx="4476750" cy="1951353"/>
-                  <wp:effectExtent l="0" t="0" r="0" b="0"/>
-                  <wp:docPr id="1001235589" name="Picture 1"/>
+                <wp:inline distT="0" distB="0" distL="0" distR="0" wp14:anchorId="3EA0B2A7" wp14:editId="35F28C62">
+                  <wp:extent cx="5729605" cy="2631440"/>
+                  <wp:effectExtent l="0" t="0" r="4445" b="0"/>
+                  <wp:docPr id="1604220789" name="Picture 1"/>
                   <wp:cNvGraphicFramePr>
                     <a:graphicFrameLocks xmlns:a="http://schemas.openxmlformats.org/drawingml/2006/main" noChangeAspect="1"/>
                   </wp:cNvGraphicFramePr>
@@ -8493,7 +8438,7 @@
                     <a:graphicData uri="http://schemas.openxmlformats.org/drawingml/2006/picture">
                       <pic:pic xmlns:pic="http://schemas.openxmlformats.org/drawingml/2006/picture">
                         <pic:nvPicPr>
-                          <pic:cNvPr id="1001235589" name=""/>
+                          <pic:cNvPr id="1604220789" name=""/>
                           <pic:cNvPicPr/>
                         </pic:nvPicPr>
                         <pic:blipFill>
@@ -8505,7 +8450,7 @@
                         <pic:spPr>
                           <a:xfrm>
                             <a:off x="0" y="0"/>
-                            <a:ext cx="4488592" cy="1956515"/>
+                            <a:ext cx="5729605" cy="2631440"/>
                           </a:xfrm>
                           <a:prstGeom prst="rect">
                             <a:avLst/>
@@ -8523,7 +8468,85 @@
           <w:tcPr>
             <w:tcW w:w="2762" w:type="dxa"/>
           </w:tcPr>
+          <w:p>
+            <w:r>
+              <w:drawing>
+                <wp:inline distT="0" distB="0" distL="0" distR="0" wp14:anchorId="4C064ABA" wp14:editId="286DA620">
+                  <wp:extent cx="1616710" cy="459740"/>
+                  <wp:effectExtent l="0" t="0" r="2540" b="0"/>
+                  <wp:docPr id="405409189" name="Picture 1"/>
+                  <wp:cNvGraphicFramePr>
+                    <a:graphicFrameLocks xmlns:a="http://schemas.openxmlformats.org/drawingml/2006/main" noChangeAspect="1"/>
+                  </wp:cNvGraphicFramePr>
+                  <a:graphic xmlns:a="http://schemas.openxmlformats.org/drawingml/2006/main">
+                    <a:graphicData uri="http://schemas.openxmlformats.org/drawingml/2006/picture">
+                      <pic:pic xmlns:pic="http://schemas.openxmlformats.org/drawingml/2006/picture">
+                        <pic:nvPicPr>
+                          <pic:cNvPr id="405409189" name=""/>
+                          <pic:cNvPicPr/>
+                        </pic:nvPicPr>
+                        <pic:blipFill>
+                          <a:blip r:embed="rId56"/>
+                          <a:stretch>
+                            <a:fillRect/>
+                          </a:stretch>
+                        </pic:blipFill>
+                        <pic:spPr>
+                          <a:xfrm>
+                            <a:off x="0" y="0"/>
+                            <a:ext cx="1616710" cy="459740"/>
+                          </a:xfrm>
+                          <a:prstGeom prst="rect">
+                            <a:avLst/>
+                          </a:prstGeom>
+                        </pic:spPr>
+                      </pic:pic>
+                    </a:graphicData>
+                  </a:graphic>
+                </wp:inline>
+              </w:drawing>
+            </w:r>
+          </w:p>
           <w:p/>
+          <w:p>
+            <w:r>
+              <w:drawing>
+                <wp:inline distT="0" distB="0" distL="0" distR="0" wp14:anchorId="5F84EF45" wp14:editId="09DC15BE">
+                  <wp:extent cx="1616710" cy="638175"/>
+                  <wp:effectExtent l="0" t="0" r="2540" b="9525"/>
+                  <wp:docPr id="1739851030" name="Picture 1"/>
+                  <wp:cNvGraphicFramePr>
+                    <a:graphicFrameLocks xmlns:a="http://schemas.openxmlformats.org/drawingml/2006/main" noChangeAspect="1"/>
+                  </wp:cNvGraphicFramePr>
+                  <a:graphic xmlns:a="http://schemas.openxmlformats.org/drawingml/2006/main">
+                    <a:graphicData uri="http://schemas.openxmlformats.org/drawingml/2006/picture">
+                      <pic:pic xmlns:pic="http://schemas.openxmlformats.org/drawingml/2006/picture">
+                        <pic:nvPicPr>
+                          <pic:cNvPr id="1739851030" name=""/>
+                          <pic:cNvPicPr/>
+                        </pic:nvPicPr>
+                        <pic:blipFill>
+                          <a:blip r:embed="rId57"/>
+                          <a:stretch>
+                            <a:fillRect/>
+                          </a:stretch>
+                        </pic:blipFill>
+                        <pic:spPr>
+                          <a:xfrm>
+                            <a:off x="0" y="0"/>
+                            <a:ext cx="1616710" cy="638175"/>
+                          </a:xfrm>
+                          <a:prstGeom prst="rect">
+                            <a:avLst/>
+                          </a:prstGeom>
+                        </pic:spPr>
+                      </pic:pic>
+                    </a:graphicData>
+                  </a:graphic>
+                </wp:inline>
+              </w:drawing>
+            </w:r>
+          </w:p>
         </w:tc>
       </w:tr>
       <w:tr>
@@ -8536,20 +8559,26 @@
             <w:gridSpan w:val="3"/>
           </w:tcPr>
           <w:p>
-            <w:r>
+            <w:pPr>
+              <w:rPr>
+                <w:lang w:val="pt-BR"/>
+              </w:rPr>
+            </w:pPr>
+            <w:r>
+              <w:rPr>
+                <w:lang w:val="pt-BR"/>
+              </w:rPr>
               <w:t xml:space="preserve">Bruto/Original:  </w:t>
             </w:r>
-            <w:hyperlink r:id="rId56" w:history="1">
+            <w:hyperlink r:id="rId58" w:history="1">
               <w:r>
                 <w:rPr>
                   <w:rStyle w:val="Hyperlink"/>
+                  <w:lang w:val="pt-BR"/>
                 </w:rPr>
                 <w:t>https://techbrazildata.s3.us-east-1.amazonaws.com/rawdata/mintraemp/README.txt</w:t>
               </w:r>
             </w:hyperlink>
-            <w:r>
-              <w:t xml:space="preserve"> </w:t>
-            </w:r>
           </w:p>
         </w:tc>
       </w:tr>
@@ -8574,13 +8603,13 @@
               </w:rPr>
               <w:t xml:space="preserve">Procesado: </w:t>
             </w:r>
-            <w:hyperlink r:id="rId57" w:history="1">
+            <w:hyperlink r:id="rId59" w:history="1">
               <w:r>
                 <w:rPr>
                   <w:rStyle w:val="Hyperlink"/>
                   <w:lang w:val="pt-BR"/>
                 </w:rPr>
-                <w:t>https://techbrazildata.s3.us-east-1.amazonaws.com/working/mintraemp/rais_caged_cbo4_mun_2023_2024.rda</w:t>
+                <w:t>https://techbrazildata.s3.us-east-1.amazonaws.com/working/mintraemp/rais_caged_cbo6_mun_2020_2024.rda</w:t>
               </w:r>
             </w:hyperlink>
             <w:r>
@@ -8641,12 +8670,749 @@
               <w:rPr>
                 <w:lang w:val="pt-BR"/>
               </w:rPr>
-              <w:t>nalisar tendências de aquecimento do mercado de trabalho para ocupaçoes técnicas por região intermediária, de forma a ter uma ideia de onde no estado faz mais sentido ofertar cursos técnicos.</w:t>
-            </w:r>
-          </w:p>
-          <w:p>
-            <w:pPr>
-              <w:rPr>
+              <w:t xml:space="preserve">nalisar tendências de aquecimento do mercado de trabalho para ocupaçoes </w:t>
+            </w:r>
+            <w:r>
+              <w:rPr>
+                <w:lang w:val="pt-BR"/>
+              </w:rPr>
+              <w:t xml:space="preserve">e municípios, </w:t>
+            </w:r>
+            <w:r>
+              <w:rPr>
+                <w:lang w:val="pt-BR"/>
+              </w:rPr>
+              <w:t>de forma a ter uma ideia de onde no estado faz mais sentido ofertar cursos técnicos.</w:t>
+            </w:r>
+            <w:r>
+              <w:rPr>
+                <w:lang w:val="pt-BR"/>
+              </w:rPr>
+              <w:t xml:space="preserve"> É possível</w:t>
+            </w:r>
+            <w:r>
+              <w:rPr>
+                <w:lang w:val="pt-BR"/>
+              </w:rPr>
+              <w:t xml:space="preserve"> agregar </w:t>
+            </w:r>
+            <w:r>
+              <w:rPr>
+                <w:lang w:val="pt-BR"/>
+              </w:rPr>
+              <w:t>em</w:t>
+            </w:r>
+            <w:r>
+              <w:rPr>
+                <w:lang w:val="pt-BR"/>
+              </w:rPr>
+              <w:t xml:space="preserve"> níveis geográficos maior</w:t>
+            </w:r>
+            <w:r>
+              <w:rPr>
+                <w:lang w:val="pt-BR"/>
+              </w:rPr>
+              <w:t>es</w:t>
+            </w:r>
+            <w:r>
+              <w:rPr>
+                <w:lang w:val="pt-BR"/>
+              </w:rPr>
+              <w:t xml:space="preserve"> assim como </w:t>
+            </w:r>
+            <w:r>
+              <w:rPr>
+                <w:lang w:val="pt-BR"/>
+              </w:rPr>
+              <w:t>em</w:t>
+            </w:r>
+            <w:r>
+              <w:rPr>
+                <w:lang w:val="pt-BR"/>
+              </w:rPr>
+              <w:t xml:space="preserve"> grupos ocupacionais mais amplos</w:t>
+            </w:r>
+            <w:r>
+              <w:rPr>
+                <w:lang w:val="pt-BR"/>
+              </w:rPr>
+              <w:t>.</w:t>
+            </w:r>
+          </w:p>
+          <w:p>
+            <w:pPr>
+              <w:rPr>
+                <w:lang w:val="pt-BR"/>
+              </w:rPr>
+            </w:pPr>
+          </w:p>
+          <w:p>
+            <w:pPr>
+              <w:rPr>
+                <w:lang w:val="pt-BR"/>
+              </w:rPr>
+            </w:pPr>
+            <w:r>
+              <w:rPr>
+                <w:lang w:val="pt-BR"/>
+              </w:rPr>
+              <w:lastRenderedPageBreak/>
+              <w:t xml:space="preserve">O código </w:t>
+            </w:r>
+            <w:r>
+              <w:rPr>
+                <w:lang w:val="pt-BR"/>
+              </w:rPr>
+              <w:t>2.preprocess_caged_rais_shiny.R</w:t>
+            </w:r>
+            <w:r>
+              <w:rPr>
+                <w:lang w:val="pt-BR"/>
+              </w:rPr>
+              <w:t xml:space="preserve"> gera os arquivos </w:t>
+            </w:r>
+            <w:r>
+              <w:rPr>
+                <w:lang w:val="pt-BR"/>
+              </w:rPr>
+              <w:t xml:space="preserve">caged_rais_cnct_2020_2024_shiny.rda </w:t>
+            </w:r>
+            <w:r>
+              <w:rPr>
+                <w:lang w:val="pt-BR"/>
+              </w:rPr>
+              <w:t xml:space="preserve">e </w:t>
+            </w:r>
+            <w:r>
+              <w:rPr>
+                <w:lang w:val="pt-BR"/>
+              </w:rPr>
+              <w:t>df_ranking_cursos_caged_rais.rda</w:t>
+            </w:r>
+            <w:r>
+              <w:rPr>
+                <w:lang w:val="pt-BR"/>
+              </w:rPr>
+              <w:t xml:space="preserve"> para serem usados no aplicativo shiny.</w:t>
+            </w:r>
+          </w:p>
+          <w:p>
+            <w:pPr>
+              <w:rPr>
+                <w:lang w:val="pt-BR"/>
+              </w:rPr>
+            </w:pPr>
+          </w:p>
+        </w:tc>
+      </w:tr>
+    </w:tbl>
+    <w:p>
+      <w:pPr>
+        <w:rPr>
+          <w:lang w:val="pt-BR"/>
+        </w:rPr>
+      </w:pPr>
+    </w:p>
+    <w:p>
+      <w:pPr>
+        <w:rPr>
+          <w:lang w:val="pt-BR"/>
+        </w:rPr>
+      </w:pPr>
+    </w:p>
+    <w:tbl>
+      <w:tblPr>
+        <w:tblStyle w:val="TableGrid"/>
+        <w:tblW w:w="14791" w:type="dxa"/>
+        <w:tblInd w:w="-815" w:type="dxa"/>
+        <w:tblLayout w:type="fixed"/>
+        <w:tblLook w:val="04A0" w:firstRow="1" w:lastRow="0" w:firstColumn="1" w:lastColumn="0" w:noHBand="0" w:noVBand="1"/>
+      </w:tblPr>
+      <w:tblGrid>
+        <w:gridCol w:w="2790"/>
+        <w:gridCol w:w="9239"/>
+        <w:gridCol w:w="2762"/>
+      </w:tblGrid>
+      <w:tr>
+        <w:trPr>
+          <w:trHeight w:val="600"/>
+        </w:trPr>
+        <w:tc>
+          <w:tcPr>
+            <w:tcW w:w="2790" w:type="dxa"/>
+            <w:shd w:val="clear" w:color="auto" w:fill="F2F2F2" w:themeFill="background1" w:themeFillShade="F2"/>
+          </w:tcPr>
+          <w:p>
+            <w:pPr>
+              <w:rPr>
+                <w:b/>
+                <w:bCs/>
+                <w:sz w:val="20"/>
+                <w:szCs w:val="20"/>
+              </w:rPr>
+            </w:pPr>
+            <w:r>
+              <w:rPr>
+                <w:b/>
+                <w:bCs/>
+                <w:sz w:val="20"/>
+                <w:szCs w:val="20"/>
+              </w:rPr>
+              <w:t>Programa utilizado para gerar</w:t>
+            </w:r>
+          </w:p>
+        </w:tc>
+        <w:tc>
+          <w:tcPr>
+            <w:tcW w:w="9239" w:type="dxa"/>
+            <w:shd w:val="clear" w:color="auto" w:fill="F2F2F2" w:themeFill="background1" w:themeFillShade="F2"/>
+          </w:tcPr>
+          <w:p>
+            <w:pPr>
+              <w:rPr>
+                <w:b/>
+                <w:bCs/>
+                <w:sz w:val="20"/>
+                <w:szCs w:val="20"/>
+                <w:lang w:val="pt-BR"/>
+              </w:rPr>
+            </w:pPr>
+            <w:r>
+              <w:rPr>
+                <w:b/>
+                <w:bCs/>
+                <w:sz w:val="20"/>
+                <w:szCs w:val="20"/>
+                <w:lang w:val="pt-BR"/>
+              </w:rPr>
+              <w:t>Variaveis de dados processados, prontos para usar no Shiny o PowerBI etc.</w:t>
+            </w:r>
+          </w:p>
+          <w:p>
+            <w:pPr>
+              <w:rPr>
+                <w:b/>
+                <w:bCs/>
+                <w:sz w:val="20"/>
+                <w:szCs w:val="20"/>
+                <w:lang w:val="pt-BR"/>
+              </w:rPr>
+            </w:pPr>
+          </w:p>
+        </w:tc>
+        <w:tc>
+          <w:tcPr>
+            <w:tcW w:w="2762" w:type="dxa"/>
+            <w:shd w:val="clear" w:color="auto" w:fill="F2F2F2" w:themeFill="background1" w:themeFillShade="F2"/>
+          </w:tcPr>
+          <w:p>
+            <w:pPr>
+              <w:rPr>
+                <w:b/>
+                <w:bCs/>
+                <w:sz w:val="20"/>
+                <w:szCs w:val="20"/>
+              </w:rPr>
+            </w:pPr>
+            <w:r>
+              <w:rPr>
+                <w:b/>
+                <w:bCs/>
+                <w:sz w:val="20"/>
+                <w:szCs w:val="20"/>
+              </w:rPr>
+              <w:t>Shiny App</w:t>
+            </w:r>
+            <w:r>
+              <w:rPr>
+                <w:b/>
+                <w:bCs/>
+                <w:sz w:val="20"/>
+                <w:szCs w:val="20"/>
+              </w:rPr>
+              <w:t xml:space="preserve"> (se existe)</w:t>
+            </w:r>
+          </w:p>
+        </w:tc>
+      </w:tr>
+      <w:tr>
+        <w:trPr>
+          <w:trHeight w:val="304"/>
+        </w:trPr>
+        <w:tc>
+          <w:tcPr>
+            <w:tcW w:w="12029" w:type="dxa"/>
+            <w:gridSpan w:val="2"/>
+          </w:tcPr>
+          <w:p>
+            <w:pPr>
+              <w:rPr>
+                <w:color w:val="0000FF"/>
+                <w:sz w:val="20"/>
+                <w:szCs w:val="20"/>
+                <w:lang w:val="pt-BR"/>
+              </w:rPr>
+            </w:pPr>
+            <w:r>
+              <w:rPr>
+                <w:color w:val="0000FF"/>
+                <w:sz w:val="20"/>
+                <w:szCs w:val="20"/>
+                <w:lang w:val="pt-BR"/>
+              </w:rPr>
+              <w:t xml:space="preserve">Matrículas EPT </w:t>
+            </w:r>
+            <w:r>
+              <w:rPr>
+                <w:color w:val="0000FF"/>
+                <w:sz w:val="20"/>
+                <w:szCs w:val="20"/>
+                <w:lang w:val="pt-BR"/>
+              </w:rPr>
+              <w:t xml:space="preserve">e EM em escolas estaduais por município conforme Censo Escolar </w:t>
+            </w:r>
+          </w:p>
+        </w:tc>
+        <w:tc>
+          <w:tcPr>
+            <w:tcW w:w="2762" w:type="dxa"/>
+          </w:tcPr>
+          <w:p>
+            <w:pPr>
+              <w:rPr>
+                <w:sz w:val="20"/>
+                <w:szCs w:val="20"/>
+                <w:lang w:val="pt-BR"/>
+              </w:rPr>
+            </w:pPr>
+          </w:p>
+        </w:tc>
+      </w:tr>
+      <w:tr>
+        <w:trPr>
+          <w:trHeight w:val="1514"/>
+        </w:trPr>
+        <w:tc>
+          <w:tcPr>
+            <w:tcW w:w="2790" w:type="dxa"/>
+          </w:tcPr>
+          <w:p>
+            <w:pPr>
+              <w:rPr>
+                <w:sz w:val="20"/>
+                <w:szCs w:val="20"/>
+                <w:lang w:val="pt-BR"/>
+              </w:rPr>
+            </w:pPr>
+            <w:hyperlink r:id="rId60" w:history="1">
+              <w:r>
+                <w:rPr>
+                  <w:rStyle w:val="Hyperlink"/>
+                  <w:sz w:val="20"/>
+                  <w:szCs w:val="20"/>
+                  <w:lang w:val="pt-BR"/>
+                </w:rPr>
+                <w:t>https://github.com/Zagamog/TechBrasil/blob/main/prelims/mec/</w:t>
+              </w:r>
+              <w:r>
+                <w:rPr>
+                  <w:rStyle w:val="Hyperlink"/>
+                  <w:sz w:val="20"/>
+                  <w:szCs w:val="20"/>
+                  <w:lang w:val="pt-BR"/>
+                </w:rPr>
+                <w:t>prepara_matriculas_ponderadas</w:t>
+              </w:r>
+              <w:r>
+                <w:rPr>
+                  <w:rStyle w:val="Hyperlink"/>
+                  <w:sz w:val="20"/>
+                  <w:szCs w:val="20"/>
+                  <w:lang w:val="pt-BR"/>
+                </w:rPr>
+                <w:t>.R</w:t>
+              </w:r>
+            </w:hyperlink>
+            <w:r>
+              <w:rPr>
+                <w:sz w:val="20"/>
+                <w:szCs w:val="20"/>
+                <w:lang w:val="pt-BR"/>
+              </w:rPr>
+              <w:t xml:space="preserve">   </w:t>
+            </w:r>
+          </w:p>
+          <w:p>
+            <w:pPr>
+              <w:rPr>
+                <w:sz w:val="20"/>
+                <w:szCs w:val="20"/>
+                <w:lang w:val="pt-BR"/>
+              </w:rPr>
+            </w:pPr>
+            <w:r>
+              <w:rPr>
+                <w:sz w:val="20"/>
+                <w:szCs w:val="20"/>
+                <w:lang w:val="pt-BR"/>
+              </w:rPr>
+              <w:t xml:space="preserve"> </w:t>
+            </w:r>
+          </w:p>
+        </w:tc>
+        <w:tc>
+          <w:tcPr>
+            <w:tcW w:w="9239" w:type="dxa"/>
+          </w:tcPr>
+          <w:p>
+            <w:pPr>
+              <w:rPr>
+                <w:sz w:val="20"/>
+                <w:szCs w:val="20"/>
+              </w:rPr>
+            </w:pPr>
+            <w:r>
+              <w:rPr>
+                <w:sz w:val="20"/>
+                <w:szCs w:val="20"/>
+              </w:rPr>
+              <w:t>1</w:t>
+            </w:r>
+            <w:r>
+              <w:rPr>
+                <w:sz w:val="20"/>
+                <w:szCs w:val="20"/>
+              </w:rPr>
+              <w:t>5</w:t>
+            </w:r>
+            <w:r>
+              <w:rPr>
+                <w:sz w:val="20"/>
+                <w:szCs w:val="20"/>
+              </w:rPr>
+              <w:t xml:space="preserve"> variaveis</w:t>
+            </w:r>
+          </w:p>
+          <w:p>
+            <w:pPr>
+              <w:rPr>
+                <w:sz w:val="20"/>
+                <w:szCs w:val="20"/>
+              </w:rPr>
+            </w:pPr>
+            <w:r>
+              <w:rPr>
+                <w:noProof/>
+                <w:sz w:val="20"/>
+                <w:szCs w:val="20"/>
+              </w:rPr>
+              <w:drawing>
+                <wp:inline distT="0" distB="0" distL="0" distR="0" wp14:anchorId="3C37784B" wp14:editId="370EAC77">
+                  <wp:extent cx="5729605" cy="2025650"/>
+                  <wp:effectExtent l="0" t="0" r="4445" b="0"/>
+                  <wp:docPr id="1120230629" name="Picture 1"/>
+                  <wp:cNvGraphicFramePr>
+                    <a:graphicFrameLocks xmlns:a="http://schemas.openxmlformats.org/drawingml/2006/main" noChangeAspect="1"/>
+                  </wp:cNvGraphicFramePr>
+                  <a:graphic xmlns:a="http://schemas.openxmlformats.org/drawingml/2006/main">
+                    <a:graphicData uri="http://schemas.openxmlformats.org/drawingml/2006/picture">
+                      <pic:pic xmlns:pic="http://schemas.openxmlformats.org/drawingml/2006/picture">
+                        <pic:nvPicPr>
+                          <pic:cNvPr id="1120230629" name=""/>
+                          <pic:cNvPicPr/>
+                        </pic:nvPicPr>
+                        <pic:blipFill>
+                          <a:blip r:embed="rId61"/>
+                          <a:stretch>
+                            <a:fillRect/>
+                          </a:stretch>
+                        </pic:blipFill>
+                        <pic:spPr>
+                          <a:xfrm>
+                            <a:off x="0" y="0"/>
+                            <a:ext cx="5729605" cy="2025650"/>
+                          </a:xfrm>
+                          <a:prstGeom prst="rect">
+                            <a:avLst/>
+                          </a:prstGeom>
+                        </pic:spPr>
+                      </pic:pic>
+                    </a:graphicData>
+                  </a:graphic>
+                </wp:inline>
+              </w:drawing>
+            </w:r>
+          </w:p>
+        </w:tc>
+        <w:tc>
+          <w:tcPr>
+            <w:tcW w:w="2762" w:type="dxa"/>
+          </w:tcPr>
+          <w:p>
+            <w:pPr>
+              <w:rPr>
+                <w:sz w:val="20"/>
+                <w:szCs w:val="20"/>
+              </w:rPr>
+            </w:pPr>
+          </w:p>
+        </w:tc>
+      </w:tr>
+      <w:tr>
+        <w:trPr>
+          <w:trHeight w:val="304"/>
+        </w:trPr>
+        <w:tc>
+          <w:tcPr>
+            <w:tcW w:w="14791" w:type="dxa"/>
+            <w:gridSpan w:val="3"/>
+          </w:tcPr>
+          <w:p>
+            <w:pPr>
+              <w:rPr>
+                <w:noProof/>
+                <w:sz w:val="20"/>
+                <w:szCs w:val="20"/>
+                <w:lang w:val="pt-BR"/>
+              </w:rPr>
+            </w:pPr>
+            <w:r>
+              <w:rPr>
+                <w:sz w:val="20"/>
+                <w:szCs w:val="20"/>
+                <w:lang w:val="pt-BR"/>
+              </w:rPr>
+              <w:t>Bruto/Original:</w:t>
+            </w:r>
+            <w:r>
+              <w:rPr>
+                <w:noProof/>
+                <w:sz w:val="20"/>
+                <w:szCs w:val="20"/>
+                <w:lang w:val="pt-BR"/>
+              </w:rPr>
+              <w:t xml:space="preserve"> </w:t>
+            </w:r>
+            <w:hyperlink r:id="rId62" w:history="1">
+              <w:r>
+                <w:rPr>
+                  <w:rStyle w:val="Hyperlink"/>
+                  <w:noProof/>
+                  <w:sz w:val="20"/>
+                  <w:szCs w:val="20"/>
+                  <w:lang w:val="pt-BR"/>
+                </w:rPr>
+                <w:t>https://techbrazildata.s3.us-east-1.amazonaws.com/rawdata/ibge/RG2017_regioesgeograficas2017_20180911/regioes_geograficas_composicao_por_municipios_2017_20180911.xlsx</w:t>
+              </w:r>
+            </w:hyperlink>
+          </w:p>
+          <w:p>
+            <w:pPr>
+              <w:rPr>
+                <w:sz w:val="20"/>
+                <w:szCs w:val="20"/>
+                <w:lang w:val="pt-BR"/>
+              </w:rPr>
+            </w:pPr>
+            <w:r>
+              <w:rPr>
+                <w:sz w:val="20"/>
+                <w:szCs w:val="20"/>
+                <w:lang w:val="pt-BR"/>
+              </w:rPr>
+              <w:t xml:space="preserve"> </w:t>
+            </w:r>
+            <w:r>
+              <w:rPr>
+                <w:noProof/>
+                <w:sz w:val="20"/>
+                <w:szCs w:val="20"/>
+                <w:lang w:val="pt-BR"/>
+              </w:rPr>
+              <w:t xml:space="preserve"> </w:t>
+            </w:r>
+            <w:hyperlink r:id="rId63" w:history="1">
+              <w:r>
+                <w:rPr>
+                  <w:rStyle w:val="Hyperlink"/>
+                  <w:noProof/>
+                  <w:sz w:val="20"/>
+                  <w:szCs w:val="20"/>
+                  <w:lang w:val="pt-BR"/>
+                </w:rPr>
+                <w:t>https://techbrazildata.s3.us-east-1.amazonaws.com/rawdata/mec_inep/matriculas_por_etapa_mun_20162024.csv</w:t>
+              </w:r>
+            </w:hyperlink>
+            <w:r>
+              <w:rPr>
+                <w:noProof/>
+                <w:sz w:val="20"/>
+                <w:szCs w:val="20"/>
+                <w:lang w:val="pt-BR"/>
+              </w:rPr>
+              <w:t xml:space="preserve"> </w:t>
+            </w:r>
+          </w:p>
+        </w:tc>
+      </w:tr>
+      <w:tr>
+        <w:trPr>
+          <w:trHeight w:val="296"/>
+        </w:trPr>
+        <w:tc>
+          <w:tcPr>
+            <w:tcW w:w="14791" w:type="dxa"/>
+            <w:gridSpan w:val="3"/>
+          </w:tcPr>
+          <w:p>
+            <w:pPr>
+              <w:rPr>
+                <w:sz w:val="20"/>
+                <w:szCs w:val="20"/>
+                <w:lang w:val="pt-BR"/>
+              </w:rPr>
+            </w:pPr>
+            <w:r>
+              <w:rPr>
+                <w:sz w:val="20"/>
+                <w:szCs w:val="20"/>
+                <w:lang w:val="pt-BR"/>
+              </w:rPr>
+              <w:t xml:space="preserve">Procesado: </w:t>
+            </w:r>
+            <w:hyperlink r:id="rId64" w:history="1">
+              <w:r>
+                <w:rPr>
+                  <w:rStyle w:val="Hyperlink"/>
+                  <w:sz w:val="20"/>
+                  <w:szCs w:val="20"/>
+                  <w:lang w:val="pt-BR"/>
+                </w:rPr>
+                <w:t>https://techbrazildata.s3.us-east-1.amazonaws.com/working/mec_inep/matriculas_total_em_ept_mun_20162024.csv</w:t>
+              </w:r>
+            </w:hyperlink>
+            <w:r>
+              <w:rPr>
+                <w:sz w:val="20"/>
+                <w:szCs w:val="20"/>
+                <w:lang w:val="pt-BR"/>
+              </w:rPr>
+              <w:t xml:space="preserve"> </w:t>
+            </w:r>
+          </w:p>
+        </w:tc>
+      </w:tr>
+      <w:tr>
+        <w:trPr>
+          <w:trHeight w:val="296"/>
+        </w:trPr>
+        <w:tc>
+          <w:tcPr>
+            <w:tcW w:w="14791" w:type="dxa"/>
+            <w:gridSpan w:val="3"/>
+          </w:tcPr>
+          <w:p>
+            <w:pPr>
+              <w:rPr>
+                <w:b/>
+                <w:bCs/>
+                <w:sz w:val="20"/>
+                <w:szCs w:val="20"/>
+                <w:lang w:val="pt-BR"/>
+              </w:rPr>
+            </w:pPr>
+            <w:r>
+              <w:rPr>
+                <w:b/>
+                <w:bCs/>
+                <w:sz w:val="20"/>
+                <w:szCs w:val="20"/>
+                <w:lang w:val="pt-BR"/>
+              </w:rPr>
+              <w:t>Usos possíveis desses dados:</w:t>
+            </w:r>
+          </w:p>
+          <w:p>
+            <w:pPr>
+              <w:rPr>
+                <w:sz w:val="20"/>
+                <w:szCs w:val="20"/>
+                <w:lang w:val="pt-BR"/>
+              </w:rPr>
+            </w:pPr>
+            <w:r>
+              <w:rPr>
+                <w:sz w:val="20"/>
+                <w:szCs w:val="20"/>
+                <w:lang w:val="pt-BR"/>
+              </w:rPr>
+              <w:t>A</w:t>
+            </w:r>
+            <w:r>
+              <w:rPr>
+                <w:sz w:val="20"/>
+                <w:szCs w:val="20"/>
+                <w:lang w:val="pt-BR"/>
+              </w:rPr>
+              <w:t xml:space="preserve">nálise da </w:t>
+            </w:r>
+            <w:r>
+              <w:rPr>
+                <w:sz w:val="20"/>
+                <w:szCs w:val="20"/>
+                <w:lang w:val="pt-BR"/>
+              </w:rPr>
+              <w:t xml:space="preserve">de </w:t>
+            </w:r>
+            <w:r>
+              <w:rPr>
+                <w:sz w:val="20"/>
+                <w:szCs w:val="20"/>
+                <w:lang w:val="pt-BR"/>
+              </w:rPr>
+              <w:t>matrículas EPT dentro de um estado, podendo ser usada no nível de município, região imediata, região intermediária ou UF</w:t>
+            </w:r>
+            <w:r>
+              <w:rPr>
+                <w:sz w:val="20"/>
+                <w:szCs w:val="20"/>
+                <w:lang w:val="pt-BR"/>
+              </w:rPr>
+              <w:t>. Disponível de 2016 até 2024.</w:t>
+            </w:r>
+          </w:p>
+          <w:p>
+            <w:pPr>
+              <w:rPr>
+                <w:sz w:val="20"/>
+                <w:szCs w:val="20"/>
+                <w:lang w:val="pt-BR"/>
+              </w:rPr>
+            </w:pPr>
+          </w:p>
+          <w:p>
+            <w:pPr>
+              <w:rPr>
+                <w:sz w:val="20"/>
+                <w:szCs w:val="20"/>
+                <w:lang w:val="pt-BR"/>
+              </w:rPr>
+            </w:pPr>
+          </w:p>
+          <w:p>
+            <w:pPr>
+              <w:rPr>
+                <w:sz w:val="20"/>
+                <w:szCs w:val="20"/>
+                <w:lang w:val="pt-BR"/>
+              </w:rPr>
+            </w:pPr>
+          </w:p>
+          <w:p>
+            <w:pPr>
+              <w:rPr>
+                <w:sz w:val="20"/>
+                <w:szCs w:val="20"/>
                 <w:lang w:val="pt-BR"/>
               </w:rPr>
             </w:pPr>
@@ -8716,16 +9482,12 @@
               <w:rPr>
                 <w:b/>
                 <w:bCs/>
-                <w:sz w:val="20"/>
-                <w:szCs w:val="20"/>
-              </w:rPr>
-            </w:pPr>
-            <w:r>
-              <w:rPr>
-                <w:b/>
-                <w:bCs/>
-                <w:sz w:val="20"/>
-                <w:szCs w:val="20"/>
+              </w:rPr>
+            </w:pPr>
+            <w:r>
+              <w:rPr>
+                <w:b/>
+                <w:bCs/>
               </w:rPr>
               <w:t>Programa utilizado para gerar</w:t>
             </w:r>
@@ -8741,17 +9503,13 @@
               <w:rPr>
                 <w:b/>
                 <w:bCs/>
-                <w:sz w:val="20"/>
-                <w:szCs w:val="20"/>
-                <w:lang w:val="pt-BR"/>
-              </w:rPr>
-            </w:pPr>
-            <w:r>
-              <w:rPr>
-                <w:b/>
-                <w:bCs/>
-                <w:sz w:val="20"/>
-                <w:szCs w:val="20"/>
+                <w:lang w:val="pt-BR"/>
+              </w:rPr>
+            </w:pPr>
+            <w:r>
+              <w:rPr>
+                <w:b/>
+                <w:bCs/>
                 <w:lang w:val="pt-BR"/>
               </w:rPr>
               <w:t>Variaveis de dados processados, prontos para usar no Shiny o PowerBI etc.</w:t>
@@ -8762,8 +9520,6 @@
               <w:rPr>
                 <w:b/>
                 <w:bCs/>
-                <w:sz w:val="20"/>
-                <w:szCs w:val="20"/>
                 <w:lang w:val="pt-BR"/>
               </w:rPr>
             </w:pPr>
@@ -8779,27 +9535,14 @@
               <w:rPr>
                 <w:b/>
                 <w:bCs/>
-                <w:sz w:val="20"/>
-                <w:szCs w:val="20"/>
-              </w:rPr>
-            </w:pPr>
-            <w:r>
-              <w:rPr>
-                <w:b/>
-                <w:bCs/>
-                <w:sz w:val="20"/>
-                <w:szCs w:val="20"/>
-              </w:rPr>
-              <w:t>Shiny App</w:t>
-            </w:r>
-            <w:r>
-              <w:rPr>
-                <w:b/>
-                <w:bCs/>
-                <w:sz w:val="20"/>
-                <w:szCs w:val="20"/>
-              </w:rPr>
-              <w:t xml:space="preserve"> (se existe)</w:t>
+              </w:rPr>
+            </w:pPr>
+            <w:r>
+              <w:rPr>
+                <w:b/>
+                <w:bCs/>
+              </w:rPr>
+              <w:t>Shiny App (se existe)</w:t>
             </w:r>
           </w:p>
         </w:tc>
@@ -8816,29 +9559,17 @@
           <w:p>
             <w:pPr>
               <w:rPr>
+                <w:lang w:val="pt-BR"/>
+              </w:rPr>
+            </w:pPr>
+            <w:r>
+              <w:rPr>
                 <w:color w:val="0000FF"/>
                 <w:sz w:val="20"/>
                 <w:szCs w:val="20"/>
                 <w:lang w:val="pt-BR"/>
               </w:rPr>
-            </w:pPr>
-            <w:r>
-              <w:rPr>
-                <w:color w:val="0000FF"/>
-                <w:sz w:val="20"/>
-                <w:szCs w:val="20"/>
-                <w:lang w:val="pt-BR"/>
-              </w:rPr>
-              <w:t xml:space="preserve">Matrículas EPT </w:t>
-            </w:r>
-            <w:r>
-              <w:rPr>
-                <w:color w:val="0000FF"/>
-                <w:sz w:val="20"/>
-                <w:szCs w:val="20"/>
-                <w:lang w:val="pt-BR"/>
-              </w:rPr>
-              <w:t xml:space="preserve">e EM em escolas estaduais por município conforme Censo Escolar </w:t>
+              <w:t>Transferências do FUNDEB para governos estaduais, estimativas para valor para EPT e EM.</w:t>
             </w:r>
           </w:p>
         </w:tc>
@@ -8849,8 +9580,6 @@
           <w:p>
             <w:pPr>
               <w:rPr>
-                <w:sz w:val="20"/>
-                <w:szCs w:val="20"/>
                 <w:lang w:val="pt-BR"/>
               </w:rPr>
             </w:pPr>
@@ -8868,599 +9597,10 @@
           <w:p>
             <w:pPr>
               <w:rPr>
-                <w:sz w:val="20"/>
-                <w:szCs w:val="20"/>
-                <w:lang w:val="pt-BR"/>
-              </w:rPr>
-            </w:pPr>
-            <w:hyperlink r:id="rId58" w:history="1">
-              <w:r>
-                <w:rPr>
-                  <w:rStyle w:val="Hyperlink"/>
-                  <w:sz w:val="20"/>
-                  <w:szCs w:val="20"/>
-                  <w:lang w:val="pt-BR"/>
-                </w:rPr>
-                <w:t>https://github.com/Zagamog/TechBrasil/blob/main/prelims/mec/</w:t>
-              </w:r>
-              <w:r>
-                <w:rPr>
-                  <w:rStyle w:val="Hyperlink"/>
-                  <w:sz w:val="20"/>
-                  <w:szCs w:val="20"/>
-                  <w:lang w:val="pt-BR"/>
-                </w:rPr>
-                <w:t>prepara_matriculas_ponderadas</w:t>
-              </w:r>
-              <w:r>
-                <w:rPr>
-                  <w:rStyle w:val="Hyperlink"/>
-                  <w:sz w:val="20"/>
-                  <w:szCs w:val="20"/>
-                  <w:lang w:val="pt-BR"/>
-                </w:rPr>
-                <w:t>.R</w:t>
-              </w:r>
-            </w:hyperlink>
-            <w:r>
-              <w:rPr>
-                <w:sz w:val="20"/>
-                <w:szCs w:val="20"/>
-                <w:lang w:val="pt-BR"/>
-              </w:rPr>
-              <w:t xml:space="preserve">   </w:t>
-            </w:r>
-          </w:p>
-          <w:p>
-            <w:pPr>
-              <w:rPr>
-                <w:sz w:val="20"/>
-                <w:szCs w:val="20"/>
-                <w:lang w:val="pt-BR"/>
-              </w:rPr>
-            </w:pPr>
-            <w:r>
-              <w:rPr>
-                <w:sz w:val="20"/>
-                <w:szCs w:val="20"/>
-                <w:lang w:val="pt-BR"/>
-              </w:rPr>
-              <w:t xml:space="preserve"> </w:t>
-            </w:r>
-          </w:p>
-        </w:tc>
-        <w:tc>
-          <w:tcPr>
-            <w:tcW w:w="9239" w:type="dxa"/>
-          </w:tcPr>
-          <w:p>
-            <w:pPr>
-              <w:rPr>
-                <w:sz w:val="20"/>
-                <w:szCs w:val="20"/>
-              </w:rPr>
-            </w:pPr>
-            <w:r>
-              <w:rPr>
-                <w:sz w:val="20"/>
-                <w:szCs w:val="20"/>
-              </w:rPr>
-              <w:t>1</w:t>
-            </w:r>
-            <w:r>
-              <w:rPr>
-                <w:sz w:val="20"/>
-                <w:szCs w:val="20"/>
-              </w:rPr>
-              <w:t>5</w:t>
-            </w:r>
-            <w:r>
-              <w:rPr>
-                <w:sz w:val="20"/>
-                <w:szCs w:val="20"/>
-              </w:rPr>
-              <w:t xml:space="preserve"> variaveis</w:t>
-            </w:r>
-          </w:p>
-          <w:p>
-            <w:pPr>
-              <w:rPr>
-                <w:sz w:val="20"/>
-                <w:szCs w:val="20"/>
-              </w:rPr>
-            </w:pPr>
-            <w:r>
-              <w:rPr>
-                <w:noProof/>
-                <w:sz w:val="20"/>
-                <w:szCs w:val="20"/>
-              </w:rPr>
-              <w:drawing>
-                <wp:inline distT="0" distB="0" distL="0" distR="0" wp14:anchorId="3C37784B" wp14:editId="370EAC77">
-                  <wp:extent cx="5729605" cy="2025650"/>
-                  <wp:effectExtent l="0" t="0" r="4445" b="0"/>
-                  <wp:docPr id="1120230629" name="Picture 1"/>
-                  <wp:cNvGraphicFramePr>
-                    <a:graphicFrameLocks xmlns:a="http://schemas.openxmlformats.org/drawingml/2006/main" noChangeAspect="1"/>
-                  </wp:cNvGraphicFramePr>
-                  <a:graphic xmlns:a="http://schemas.openxmlformats.org/drawingml/2006/main">
-                    <a:graphicData uri="http://schemas.openxmlformats.org/drawingml/2006/picture">
-                      <pic:pic xmlns:pic="http://schemas.openxmlformats.org/drawingml/2006/picture">
-                        <pic:nvPicPr>
-                          <pic:cNvPr id="1120230629" name=""/>
-                          <pic:cNvPicPr/>
-                        </pic:nvPicPr>
-                        <pic:blipFill>
-                          <a:blip r:embed="rId59"/>
-                          <a:stretch>
-                            <a:fillRect/>
-                          </a:stretch>
-                        </pic:blipFill>
-                        <pic:spPr>
-                          <a:xfrm>
-                            <a:off x="0" y="0"/>
-                            <a:ext cx="5729605" cy="2025650"/>
-                          </a:xfrm>
-                          <a:prstGeom prst="rect">
-                            <a:avLst/>
-                          </a:prstGeom>
-                        </pic:spPr>
-                      </pic:pic>
-                    </a:graphicData>
-                  </a:graphic>
-                </wp:inline>
-              </w:drawing>
-            </w:r>
-          </w:p>
-        </w:tc>
-        <w:tc>
-          <w:tcPr>
-            <w:tcW w:w="2762" w:type="dxa"/>
-          </w:tcPr>
-          <w:p>
-            <w:pPr>
-              <w:rPr>
-                <w:sz w:val="20"/>
-                <w:szCs w:val="20"/>
-              </w:rPr>
-            </w:pPr>
-          </w:p>
-        </w:tc>
-      </w:tr>
-      <w:tr>
-        <w:trPr>
-          <w:trHeight w:val="304"/>
-        </w:trPr>
-        <w:tc>
-          <w:tcPr>
-            <w:tcW w:w="14791" w:type="dxa"/>
-            <w:gridSpan w:val="3"/>
-          </w:tcPr>
-          <w:p>
-            <w:pPr>
-              <w:rPr>
-                <w:noProof/>
-                <w:sz w:val="20"/>
-                <w:szCs w:val="20"/>
-              </w:rPr>
-            </w:pPr>
-            <w:r>
-              <w:rPr>
-                <w:sz w:val="20"/>
-                <w:szCs w:val="20"/>
-              </w:rPr>
-              <w:t>Bruto/Original:</w:t>
-            </w:r>
-            <w:r>
-              <w:rPr>
-                <w:noProof/>
-                <w:sz w:val="20"/>
-                <w:szCs w:val="20"/>
-              </w:rPr>
-              <w:t xml:space="preserve"> </w:t>
-            </w:r>
-            <w:hyperlink r:id="rId60" w:history="1">
-              <w:r>
-                <w:rPr>
-                  <w:rStyle w:val="Hyperlink"/>
-                  <w:noProof/>
-                  <w:sz w:val="20"/>
-                  <w:szCs w:val="20"/>
-                </w:rPr>
-                <w:t>https://techbrazildata.s3.us-east-1.amazonaws.com/rawdata/ibge/RG2017_regioesgeograficas2017_20180911/regioes_geograficas_composicao_por_municipios_2017_20180911.xlsx</w:t>
-              </w:r>
-            </w:hyperlink>
-          </w:p>
-          <w:p>
-            <w:pPr>
-              <w:rPr>
-                <w:sz w:val="20"/>
-                <w:szCs w:val="20"/>
-              </w:rPr>
-            </w:pPr>
-            <w:r>
-              <w:rPr>
-                <w:sz w:val="20"/>
-                <w:szCs w:val="20"/>
-              </w:rPr>
-              <w:t xml:space="preserve"> </w:t>
-            </w:r>
-            <w:r>
-              <w:rPr>
-                <w:noProof/>
-                <w:sz w:val="20"/>
-                <w:szCs w:val="20"/>
-              </w:rPr>
-              <w:t xml:space="preserve"> </w:t>
-            </w:r>
-            <w:hyperlink r:id="rId61" w:history="1">
-              <w:r>
-                <w:rPr>
-                  <w:rStyle w:val="Hyperlink"/>
-                  <w:noProof/>
-                  <w:sz w:val="20"/>
-                  <w:szCs w:val="20"/>
-                </w:rPr>
-                <w:t>https://techbrazildata.s3.us-east-1.amazonaws.com/rawdata/mec_inep/matriculas_por_etapa_mun_20162024.csv</w:t>
-              </w:r>
-            </w:hyperlink>
-            <w:r>
-              <w:rPr>
-                <w:noProof/>
-                <w:sz w:val="20"/>
-                <w:szCs w:val="20"/>
-              </w:rPr>
-              <w:t xml:space="preserve"> </w:t>
-            </w:r>
-          </w:p>
-        </w:tc>
-      </w:tr>
-      <w:tr>
-        <w:trPr>
-          <w:trHeight w:val="296"/>
-        </w:trPr>
-        <w:tc>
-          <w:tcPr>
-            <w:tcW w:w="14791" w:type="dxa"/>
-            <w:gridSpan w:val="3"/>
-          </w:tcPr>
-          <w:p>
-            <w:pPr>
-              <w:rPr>
-                <w:sz w:val="20"/>
-                <w:szCs w:val="20"/>
-                <w:lang w:val="pt-BR"/>
-              </w:rPr>
-            </w:pPr>
-            <w:r>
-              <w:rPr>
-                <w:sz w:val="20"/>
-                <w:szCs w:val="20"/>
-                <w:lang w:val="pt-BR"/>
-              </w:rPr>
-              <w:t xml:space="preserve">Procesado: </w:t>
-            </w:r>
-            <w:hyperlink r:id="rId62" w:history="1">
-              <w:r>
-                <w:rPr>
-                  <w:rStyle w:val="Hyperlink"/>
-                  <w:sz w:val="20"/>
-                  <w:szCs w:val="20"/>
-                  <w:lang w:val="pt-BR"/>
-                </w:rPr>
-                <w:t>https://techbrazildata.s3.us-east-1.amazonaws.com/working/mec_inep/matriculas_total_em_ept_mun_20162024.csv</w:t>
-              </w:r>
-            </w:hyperlink>
-            <w:r>
-              <w:rPr>
-                <w:sz w:val="20"/>
-                <w:szCs w:val="20"/>
-                <w:lang w:val="pt-BR"/>
-              </w:rPr>
-              <w:t xml:space="preserve"> </w:t>
-            </w:r>
-          </w:p>
-        </w:tc>
-      </w:tr>
-      <w:tr>
-        <w:trPr>
-          <w:trHeight w:val="296"/>
-        </w:trPr>
-        <w:tc>
-          <w:tcPr>
-            <w:tcW w:w="14791" w:type="dxa"/>
-            <w:gridSpan w:val="3"/>
-          </w:tcPr>
-          <w:p>
-            <w:pPr>
-              <w:rPr>
-                <w:b/>
-                <w:bCs/>
-                <w:sz w:val="20"/>
-                <w:szCs w:val="20"/>
-                <w:lang w:val="pt-BR"/>
-              </w:rPr>
-            </w:pPr>
-            <w:r>
-              <w:rPr>
-                <w:b/>
-                <w:bCs/>
-                <w:sz w:val="20"/>
-                <w:szCs w:val="20"/>
-                <w:lang w:val="pt-BR"/>
-              </w:rPr>
-              <w:t>Usos possíveis desses dados:</w:t>
-            </w:r>
-          </w:p>
-          <w:p>
-            <w:pPr>
-              <w:rPr>
-                <w:sz w:val="20"/>
-                <w:szCs w:val="20"/>
-                <w:lang w:val="pt-BR"/>
-              </w:rPr>
-            </w:pPr>
-            <w:r>
-              <w:rPr>
-                <w:sz w:val="20"/>
-                <w:szCs w:val="20"/>
-                <w:lang w:val="pt-BR"/>
-              </w:rPr>
-              <w:t>A</w:t>
-            </w:r>
-            <w:r>
-              <w:rPr>
-                <w:sz w:val="20"/>
-                <w:szCs w:val="20"/>
-                <w:lang w:val="pt-BR"/>
-              </w:rPr>
-              <w:t xml:space="preserve">nálise da </w:t>
-            </w:r>
-            <w:r>
-              <w:rPr>
-                <w:sz w:val="20"/>
-                <w:szCs w:val="20"/>
-                <w:lang w:val="pt-BR"/>
-              </w:rPr>
-              <w:t xml:space="preserve">de </w:t>
-            </w:r>
-            <w:r>
-              <w:rPr>
-                <w:sz w:val="20"/>
-                <w:szCs w:val="20"/>
-                <w:lang w:val="pt-BR"/>
-              </w:rPr>
-              <w:t>matrículas EPT dentro de um estado, podendo ser usada no nível de município, região imediata, região intermediária ou UF</w:t>
-            </w:r>
-            <w:r>
-              <w:rPr>
-                <w:sz w:val="20"/>
-                <w:szCs w:val="20"/>
-                <w:lang w:val="pt-BR"/>
-              </w:rPr>
-              <w:t>. Disponível de 2016 até 2024.</w:t>
-            </w:r>
-          </w:p>
-          <w:p>
-            <w:pPr>
-              <w:rPr>
-                <w:sz w:val="20"/>
-                <w:szCs w:val="20"/>
-                <w:lang w:val="pt-BR"/>
-              </w:rPr>
-            </w:pPr>
-          </w:p>
-          <w:p>
-            <w:pPr>
-              <w:rPr>
-                <w:sz w:val="20"/>
-                <w:szCs w:val="20"/>
-                <w:lang w:val="pt-BR"/>
-              </w:rPr>
-            </w:pPr>
-          </w:p>
-          <w:p>
-            <w:pPr>
-              <w:rPr>
-                <w:sz w:val="20"/>
-                <w:szCs w:val="20"/>
-                <w:lang w:val="pt-BR"/>
-              </w:rPr>
-            </w:pPr>
-          </w:p>
-          <w:p>
-            <w:pPr>
-              <w:rPr>
-                <w:sz w:val="20"/>
-                <w:szCs w:val="20"/>
-                <w:lang w:val="pt-BR"/>
-              </w:rPr>
-            </w:pPr>
-          </w:p>
-        </w:tc>
-      </w:tr>
-    </w:tbl>
-    <w:p>
-      <w:pPr>
-        <w:rPr>
-          <w:lang w:val="pt-BR"/>
-        </w:rPr>
-      </w:pPr>
-    </w:p>
-    <w:p>
-      <w:pPr>
-        <w:rPr>
-          <w:lang w:val="pt-BR"/>
-        </w:rPr>
-      </w:pPr>
-    </w:p>
-    <w:p>
-      <w:pPr>
-        <w:rPr>
-          <w:lang w:val="pt-BR"/>
-        </w:rPr>
-      </w:pPr>
-    </w:p>
-    <w:p>
-      <w:pPr>
-        <w:rPr>
-          <w:lang w:val="pt-BR"/>
-        </w:rPr>
-      </w:pPr>
-    </w:p>
-    <w:p>
-      <w:pPr>
-        <w:rPr>
-          <w:lang w:val="pt-BR"/>
-        </w:rPr>
-      </w:pPr>
-    </w:p>
-    <w:tbl>
-      <w:tblPr>
-        <w:tblStyle w:val="TableGrid"/>
-        <w:tblW w:w="14791" w:type="dxa"/>
-        <w:tblInd w:w="-815" w:type="dxa"/>
-        <w:tblLayout w:type="fixed"/>
-        <w:tblLook w:val="04A0" w:firstRow="1" w:lastRow="0" w:firstColumn="1" w:lastColumn="0" w:noHBand="0" w:noVBand="1"/>
-      </w:tblPr>
-      <w:tblGrid>
-        <w:gridCol w:w="2790"/>
-        <w:gridCol w:w="9239"/>
-        <w:gridCol w:w="2762"/>
-      </w:tblGrid>
-      <w:tr>
-        <w:trPr>
-          <w:trHeight w:val="600"/>
-        </w:trPr>
-        <w:tc>
-          <w:tcPr>
-            <w:tcW w:w="2790" w:type="dxa"/>
-            <w:shd w:val="clear" w:color="auto" w:fill="F2F2F2" w:themeFill="background1" w:themeFillShade="F2"/>
-          </w:tcPr>
-          <w:p>
-            <w:pPr>
-              <w:rPr>
-                <w:b/>
-                <w:bCs/>
-              </w:rPr>
-            </w:pPr>
-            <w:r>
-              <w:rPr>
-                <w:b/>
-                <w:bCs/>
-              </w:rPr>
-              <w:t>Programa utilizado para gerar</w:t>
-            </w:r>
-          </w:p>
-        </w:tc>
-        <w:tc>
-          <w:tcPr>
-            <w:tcW w:w="9239" w:type="dxa"/>
-            <w:shd w:val="clear" w:color="auto" w:fill="F2F2F2" w:themeFill="background1" w:themeFillShade="F2"/>
-          </w:tcPr>
-          <w:p>
-            <w:pPr>
-              <w:rPr>
-                <w:b/>
-                <w:bCs/>
-                <w:lang w:val="pt-BR"/>
-              </w:rPr>
-            </w:pPr>
-            <w:r>
-              <w:rPr>
-                <w:b/>
-                <w:bCs/>
-                <w:lang w:val="pt-BR"/>
-              </w:rPr>
-              <w:t>Variaveis de dados processados, prontos para usar no Shiny o PowerBI etc.</w:t>
-            </w:r>
-          </w:p>
-          <w:p>
-            <w:pPr>
-              <w:rPr>
-                <w:b/>
-                <w:bCs/>
-                <w:lang w:val="pt-BR"/>
-              </w:rPr>
-            </w:pPr>
-          </w:p>
-        </w:tc>
-        <w:tc>
-          <w:tcPr>
-            <w:tcW w:w="2762" w:type="dxa"/>
-            <w:shd w:val="clear" w:color="auto" w:fill="F2F2F2" w:themeFill="background1" w:themeFillShade="F2"/>
-          </w:tcPr>
-          <w:p>
-            <w:pPr>
-              <w:rPr>
-                <w:b/>
-                <w:bCs/>
-              </w:rPr>
-            </w:pPr>
-            <w:r>
-              <w:rPr>
-                <w:b/>
-                <w:bCs/>
-              </w:rPr>
-              <w:t>Shiny App (se existe)</w:t>
-            </w:r>
-          </w:p>
-        </w:tc>
-      </w:tr>
-      <w:tr>
-        <w:trPr>
-          <w:trHeight w:val="304"/>
-        </w:trPr>
-        <w:tc>
-          <w:tcPr>
-            <w:tcW w:w="12029" w:type="dxa"/>
-            <w:gridSpan w:val="2"/>
-          </w:tcPr>
-          <w:p>
-            <w:pPr>
-              <w:rPr>
-                <w:lang w:val="pt-BR"/>
-              </w:rPr>
-            </w:pPr>
-            <w:r>
-              <w:rPr>
-                <w:color w:val="0000FF"/>
-                <w:sz w:val="20"/>
-                <w:szCs w:val="20"/>
-                <w:lang w:val="pt-BR"/>
-              </w:rPr>
-              <w:t>Transferências do FUNDEB para governos estaduais, estimativas para valor para EPT e EM.</w:t>
-            </w:r>
-          </w:p>
-        </w:tc>
-        <w:tc>
-          <w:tcPr>
-            <w:tcW w:w="2762" w:type="dxa"/>
-          </w:tcPr>
-          <w:p>
-            <w:pPr>
-              <w:rPr>
-                <w:lang w:val="pt-BR"/>
-              </w:rPr>
-            </w:pPr>
-          </w:p>
-        </w:tc>
-      </w:tr>
-      <w:tr>
-        <w:trPr>
-          <w:trHeight w:val="1514"/>
-        </w:trPr>
-        <w:tc>
-          <w:tcPr>
-            <w:tcW w:w="2790" w:type="dxa"/>
-          </w:tcPr>
-          <w:p>
-            <w:pPr>
-              <w:rPr>
-                <w:lang w:val="pt-BR"/>
-              </w:rPr>
-            </w:pPr>
-            <w:hyperlink r:id="rId63" w:history="1">
+                <w:lang w:val="pt-BR"/>
+              </w:rPr>
+            </w:pPr>
+            <w:hyperlink r:id="rId65" w:history="1">
               <w:r>
                 <w:rPr>
                   <w:rStyle w:val="Hyperlink"/>
@@ -9526,7 +9666,7 @@
                           <pic:cNvPicPr/>
                         </pic:nvPicPr>
                         <pic:blipFill>
-                          <a:blip r:embed="rId64"/>
+                          <a:blip r:embed="rId66"/>
                           <a:stretch>
                             <a:fillRect/>
                           </a:stretch>
@@ -9565,18 +9705,30 @@
             <w:gridSpan w:val="3"/>
           </w:tcPr>
           <w:p>
-            <w:r>
+            <w:pPr>
+              <w:rPr>
+                <w:lang w:val="pt-BR"/>
+              </w:rPr>
+            </w:pPr>
+            <w:r>
+              <w:rPr>
+                <w:lang w:val="pt-BR"/>
+              </w:rPr>
               <w:t xml:space="preserve">Bruto/Original:  </w:t>
             </w:r>
-            <w:hyperlink r:id="rId65" w:history="1">
+            <w:hyperlink r:id="rId67" w:history="1">
               <w:r>
                 <w:rPr>
                   <w:rStyle w:val="Hyperlink"/>
+                  <w:lang w:val="pt-BR"/>
                 </w:rPr>
                 <w:t>https://us-east-1.console.aws.amazon.com/s3/buckets/techbrazildata?region=us-east-1&amp;bucketType=general&amp;prefix=rawdata/fundeb/&amp;showversions=false</w:t>
               </w:r>
             </w:hyperlink>
             <w:r>
+              <w:rPr>
+                <w:lang w:val="pt-BR"/>
+              </w:rPr>
               <w:t xml:space="preserve">  </w:t>
             </w:r>
             <w:r>
@@ -9599,7 +9751,7 @@
                           <pic:cNvPicPr/>
                         </pic:nvPicPr>
                         <pic:blipFill rotWithShape="1">
-                          <a:blip r:embed="rId66"/>
+                          <a:blip r:embed="rId68"/>
                           <a:srcRect b="59162"/>
                           <a:stretch/>
                         </pic:blipFill>
@@ -9650,7 +9802,7 @@
               </w:rPr>
               <w:t xml:space="preserve">Procesado: </w:t>
             </w:r>
-            <w:hyperlink r:id="rId67" w:history="1">
+            <w:hyperlink r:id="rId69" w:history="1">
               <w:r>
                 <w:rPr>
                   <w:rStyle w:val="Hyperlink"/>
@@ -10088,7 +10240,7 @@
                 <w:szCs w:val="20"/>
               </w:rPr>
             </w:pPr>
-            <w:hyperlink r:id="rId68" w:history="1">
+            <w:hyperlink r:id="rId70" w:history="1">
               <w:r>
                 <w:rPr>
                   <w:rStyle w:val="Hyperlink"/>
@@ -10171,7 +10323,7 @@
                           <pic:cNvPicPr/>
                         </pic:nvPicPr>
                         <pic:blipFill>
-                          <a:blip r:embed="rId69"/>
+                          <a:blip r:embed="rId71"/>
                           <a:stretch>
                             <a:fillRect/>
                           </a:stretch>
@@ -10274,7 +10426,7 @@
               </w:rPr>
               <w:t xml:space="preserve">Procesado: </w:t>
             </w:r>
-            <w:hyperlink r:id="rId70" w:history="1">
+            <w:hyperlink r:id="rId72" w:history="1">
               <w:r>
                 <w:rPr>
                   <w:rStyle w:val="Hyperlink"/>
@@ -10406,10 +10558,10 @@
       </w:pPr>
     </w:p>
     <w:sectPr>
-      <w:headerReference w:type="default" r:id="rId71"/>
-      <w:footerReference w:type="even" r:id="rId72"/>
-      <w:footerReference w:type="default" r:id="rId73"/>
-      <w:footerReference w:type="first" r:id="rId74"/>
+      <w:headerReference w:type="default" r:id="rId73"/>
+      <w:footerReference w:type="even" r:id="rId74"/>
+      <w:footerReference w:type="default" r:id="rId75"/>
+      <w:footerReference w:type="first" r:id="rId76"/>
       <w:pgSz w:w="15840" w:h="12240" w:orient="landscape"/>
       <w:pgMar w:top="1440" w:right="1440" w:bottom="1440" w:left="1440" w:header="720" w:footer="720" w:gutter="0"/>
       <w:cols w:space="720"/>
@@ -11392,7 +11544,6 @@
   <w:style w:type="character" w:default="1" w:styleId="DefaultParagraphFont">
     <w:name w:val="Default Paragraph Font"/>
     <w:uiPriority w:val="1"/>
-    <w:semiHidden/>
     <w:unhideWhenUsed/>
   </w:style>
   <w:style w:type="table" w:default="1" w:styleId="TableNormal">

</xml_diff>